<commit_message>
docs(papers): LX 정책적 함의 초안 + Word 본 갱신
Co-Authored-By: Claude Sonnet 5.5 <noreply@anthropic.com>
Claude-Session: https://claude.ai/code/session_01SB3Kb3dUky5rKPgY7HJoGz
</commit_message>
<xml_diff>
--- a/docs/apply/_submit/LX-page-draft-2026-10-06.docx
+++ b/docs/apply/_submit/LX-page-draft-2026-10-06.docx
@@ -2118,9 +2118,78 @@
       <w:r>
         <w:rPr>
           <w:rFonts w:ascii="Malgun Gothic" w:hAnsi="Malgun Gothic" w:eastAsia="Malgun Gothic" w:cs="Malgun Gothic"/>
+          <w:b w:val="0"/>
+        </w:rPr>
+        <w:t>공공행정자료를 결합해 건물·층 단위 공실 정보를 산출하는 일은 공간정보 행정이 자체 사업이나 위탁 사업으로 도입할 수 있는 과제이다. 본 사례가 시사하는 것은, 그러한 산출물을 활용하거나 공개할 때 값과 함께 다음 세 가지를 보고하는 것이 필요하다는 점이다. 이는 본 연구 결과에서 도출한 설계상의 제안이며, 이 보고가 이용자의 판단을 개선하는지는 검증하지 않았다.</w:t>
+      </w:r>
+    </w:p>
+    <w:p>
+      <w:r>
+        <w:rPr>
+          <w:rFonts w:ascii="Malgun Gothic" w:hAnsi="Malgun Gothic" w:eastAsia="Malgun Gothic" w:cs="Malgun Gothic"/>
+          <w:b w:val="0"/>
+        </w:rPr>
+        <w:t xml:space="preserve">첫째, </w:t>
+      </w:r>
+      <w:r>
+        <w:rPr>
+          <w:rFonts w:ascii="Malgun Gothic" w:hAnsi="Malgun Gothic" w:eastAsia="Malgun Gothic" w:cs="Malgun Gothic"/>
           <w:b/>
         </w:rPr>
-        <w:t>[정책적 함의 기입 필요: 행정이 이 결합을 쓸 때 함께 공개·보고할 것(입력 묶음 특정 · 검사 단위 · 미평가 항목) — 대표자가 직접 작성]</w:t>
+        <w:t>입력 묶음을 특정해야 한다.</w:t>
+      </w:r>
+      <w:r>
+        <w:rPr>
+          <w:rFonts w:ascii="Malgun Gothic" w:hAnsi="Malgun Gothic" w:eastAsia="Malgun Gothic" w:cs="Malgun Gothic"/>
+          <w:b w:val="0"/>
+        </w:rPr>
+        <w:t xml:space="preserve"> 같은 계산이라도 어느 시점의 어떤 자료를 입력했는지에 따라 결과가 달라지므로, 산출물에는 사용한 원천 자료의 범위와 고정 방법, 그리고 같은 입력으로 다시 계산했을 때 일치하는지 여부를 함께 기록하는 것이 바람직하다. 고정 입력의 반복 재현은 입력이 특정될 때에만 의미가 있다.</w:t>
+      </w:r>
+    </w:p>
+    <w:p>
+      <w:r>
+        <w:rPr>
+          <w:rFonts w:ascii="Malgun Gothic" w:hAnsi="Malgun Gothic" w:eastAsia="Malgun Gothic" w:cs="Malgun Gothic"/>
+          <w:b w:val="0"/>
+        </w:rPr>
+        <w:t xml:space="preserve">둘째, </w:t>
+      </w:r>
+      <w:r>
+        <w:rPr>
+          <w:rFonts w:ascii="Malgun Gothic" w:hAnsi="Malgun Gothic" w:eastAsia="Malgun Gothic" w:cs="Malgun Gothic"/>
+          <w:b/>
+        </w:rPr>
+        <w:t>검사 단위를 구분해 보고해야 한다.</w:t>
+      </w:r>
+      <w:r>
+        <w:rPr>
+          <w:rFonts w:ascii="Malgun Gothic" w:hAnsi="Malgun Gothic" w:eastAsia="Malgun Gothic" w:cs="Malgun Gothic"/>
+          <w:b w:val="0"/>
+        </w:rPr>
+        <w:t xml:space="preserve"> 표시 객체인 건물 폴리곤, 집계 객체인 지번, 출력 객체인 격자는 서로 다른 단위이다. 거점 합계가 일치한다는 사실을 격자별 출력의 안정성으로 읽을 수 없고, 같은 지번 안의 값 차이를 곧바로 오류로 셀 수도 없다. 격자 단위 산출물을 공개하는 행정은 입력 정렬이나 처리 순서에 따라 격자 소속이 달라질 수 있음을 확인하고, 그 조건을 고정하거나 명시해야 한다.</w:t>
+      </w:r>
+    </w:p>
+    <w:p>
+      <w:r>
+        <w:rPr>
+          <w:rFonts w:ascii="Malgun Gothic" w:hAnsi="Malgun Gothic" w:eastAsia="Malgun Gothic" w:cs="Malgun Gothic"/>
+          <w:b w:val="0"/>
+        </w:rPr>
+        <w:t xml:space="preserve">셋째, </w:t>
+      </w:r>
+      <w:r>
+        <w:rPr>
+          <w:rFonts w:ascii="Malgun Gothic" w:hAnsi="Malgun Gothic" w:eastAsia="Malgun Gothic" w:cs="Malgun Gothic"/>
+          <w:b/>
+        </w:rPr>
+        <w:t>미평가 항목을 드러내야 한다.</w:t>
+      </w:r>
+      <w:r>
+        <w:rPr>
+          <w:rFonts w:ascii="Malgun Gothic" w:hAnsi="Malgun Gothic" w:eastAsia="Malgun Gothic" w:cs="Malgun Gothic"/>
+          <w:b w:val="0"/>
+        </w:rPr>
+        <w:t xml:space="preserve"> 구조 검사의 통과나 응답의 재현은 현실 공실 정확도의 보증이 아니다. 층 정보가 부족한 건물의 배정 범위는 통계적 신뢰구간이나 현실 오차와 구별해 적어야 하며, 현장 정답으로 확인하지 못한 항목은 확인하지 못했다고 밝혀야 한다. 현실 정확도를 검증하려면 관측시점이 맞는 참조자료와 독립 검토 절차를 먼저 갖추어야 하는데, 지번·건물·필지 자료를 보유한 행정과 공사가 이 참조 확보의 가장 가까운 위치에 있다는 점을 후속 협력의 가능성으로 제시한다.</w:t>
       </w:r>
     </w:p>
     <w:p>

</xml_diff>